<commit_message>
docs: adicao dos fluxos de eventos
</commit_message>
<xml_diff>
--- a/ApêndiceC-Análise/4 -VisãoComportamental/PID- Segurança-Acesso.docx
+++ b/ApêndiceC-Análise/4 -VisãoComportamental/PID- Segurança-Acesso.docx
@@ -295,6 +295,14 @@
           <w:szCs w:val="24"/>
         </w:rPr>
         <w:t xml:space="preserve">Módulo: </w:t>
+      </w:r>
+      <w:r>
+        <w:rPr>
+          <w:rFonts w:ascii="Times New Roman" w:eastAsia="Times New Roman" w:hAnsi="Times New Roman" w:cs="Times New Roman"/>
+          <w:sz w:val="24"/>
+          <w:szCs w:val="24"/>
+        </w:rPr>
+        <w:t>Segurança e Acesso</w:t>
       </w:r>
     </w:p>
     <w:tbl>
@@ -2307,7 +2315,6 @@
   <w:style w:type="character" w:default="1" w:styleId="Fontepargpadro">
     <w:name w:val="Default Paragraph Font"/>
     <w:uiPriority w:val="1"/>
-    <w:semiHidden/>
     <w:unhideWhenUsed/>
   </w:style>
   <w:style w:type="table" w:default="1" w:styleId="Tabelanormal">

</xml_diff>